<commit_message>
1a and 1d complete
</commit_message>
<xml_diff>
--- a/iit/quiz2/ITWS1100-S26-Quiz2-collid7.docx
+++ b/iit/quiz2/ITWS1100-S26-Quiz2-collid7.docx
@@ -23,7 +23,13 @@
         <w:t>Name:</w:t>
       </w:r>
       <w:r>
-        <w:t xml:space="preserve"> ________________________________________________________________________</w:t>
+        <w:t xml:space="preserve"> __</w:t>
+      </w:r>
+      <w:r>
+        <w:t>D’Andre Collins</w:t>
+      </w:r>
+      <w:r>
+        <w:t>______________________________________________________________________</w:t>
       </w:r>
     </w:p>
     <w:p>

</xml_diff>